<commit_message>
added all three retriever results
</commit_message>
<xml_diff>
--- a/Capstone Checkpoint 2.1/Worksheet/Required_Capstone_Checkpoint_2_1_Worksheet.docx
+++ b/Capstone Checkpoint 2.1/Worksheet/Required_Capstone_Checkpoint_2_1_Worksheet.docx
@@ -626,7 +626,23 @@
                 <w:sz w:val="24"/>
                 <w:szCs w:val="24"/>
               </w:rPr>
-              <w:t>Vector Search encodes queries and Wikipedia text chunks into vector embeddings using 'embedding-3-small' embedding model. It computes cosine similarity to retrieve based on semantic meaning, context, synonyms even when exact keywords do not match. It can miss exact dates, words used in search. It needs high storage and computing.</w:t>
+              <w:t xml:space="preserve">Vector Search encodes queries and Wikipedia text chunks into vector embeddings using 'embedding-3-small' embedding model. It computes cosine similarity to retrieve based on semantic meaning, context, synonyms even when exact keywords do not match. It can miss exact </w:t>
+            </w:r>
+            <w:proofErr w:type="gramStart"/>
+            <w:r>
+              <w:rPr>
+                <w:sz w:val="24"/>
+                <w:szCs w:val="24"/>
+              </w:rPr>
+              <w:t>dates,</w:t>
+            </w:r>
+            <w:proofErr w:type="gramEnd"/>
+            <w:r>
+              <w:rPr>
+                <w:sz w:val="24"/>
+                <w:szCs w:val="24"/>
+              </w:rPr>
+              <w:t xml:space="preserve"> words used in search. It needs high storage and computing.</w:t>
             </w:r>
           </w:p>
           <w:p>
@@ -676,33 +692,13 @@
                 <w:szCs w:val="24"/>
               </w:rPr>
             </w:pPr>
-          </w:p>
-          <w:p>
-            <w:pPr>
-              <w:spacing w:after="120"/>
-              <w:rPr>
-                <w:sz w:val="24"/>
-                <w:szCs w:val="24"/>
-              </w:rPr>
-            </w:pPr>
-          </w:p>
-          <w:p>
-            <w:pPr>
-              <w:spacing w:after="120"/>
-              <w:rPr>
-                <w:sz w:val="24"/>
-                <w:szCs w:val="24"/>
-              </w:rPr>
-            </w:pPr>
-          </w:p>
-          <w:p>
-            <w:pPr>
-              <w:spacing w:after="120"/>
-              <w:rPr>
-                <w:sz w:val="24"/>
-                <w:szCs w:val="24"/>
-              </w:rPr>
-            </w:pPr>
+            <w:r>
+              <w:rPr>
+                <w:sz w:val="24"/>
+                <w:szCs w:val="24"/>
+              </w:rPr>
+              <w:t>Note: It can also print answers from all three techniques at the same time</w:t>
+            </w:r>
           </w:p>
         </w:tc>
       </w:tr>
@@ -903,6 +899,7 @@
             </w:pPr>
             <w:r>
               <w:rPr>
+                <w:noProof/>
                 <w:sz w:val="24"/>
                 <w:szCs w:val="24"/>
               </w:rPr>
@@ -959,72 +956,6 @@
           </w:p>
           <w:p>
             <w:pPr>
-              <w:rPr>
-                <w:sz w:val="24"/>
-                <w:szCs w:val="24"/>
-              </w:rPr>
-            </w:pPr>
-            <w:r>
-              <w:rPr>
-                <w:sz w:val="24"/>
-                <w:szCs w:val="24"/>
-              </w:rPr>
-              <w:t> </w:t>
-            </w:r>
-          </w:p>
-          <w:p>
-            <w:pPr>
-              <w:rPr>
-                <w:sz w:val="24"/>
-                <w:szCs w:val="24"/>
-              </w:rPr>
-            </w:pPr>
-            <w:r>
-              <w:rPr>
-                <w:sz w:val="24"/>
-                <w:szCs w:val="24"/>
-              </w:rPr>
-              <w:t> </w:t>
-            </w:r>
-          </w:p>
-          <w:p>
-            <w:pPr>
-              <w:spacing w:after="120"/>
-              <w:rPr>
-                <w:sz w:val="24"/>
-                <w:szCs w:val="24"/>
-              </w:rPr>
-            </w:pPr>
-          </w:p>
-          <w:p>
-            <w:pPr>
-              <w:spacing w:after="120"/>
-              <w:rPr>
-                <w:sz w:val="24"/>
-                <w:szCs w:val="24"/>
-              </w:rPr>
-            </w:pPr>
-          </w:p>
-          <w:p>
-            <w:pPr>
-              <w:spacing w:after="120"/>
-              <w:rPr>
-                <w:sz w:val="24"/>
-                <w:szCs w:val="24"/>
-              </w:rPr>
-            </w:pPr>
-          </w:p>
-          <w:p>
-            <w:pPr>
-              <w:spacing w:after="120"/>
-              <w:rPr>
-                <w:sz w:val="24"/>
-                <w:szCs w:val="24"/>
-              </w:rPr>
-            </w:pPr>
-          </w:p>
-          <w:p>
-            <w:pPr>
               <w:spacing w:after="120"/>
               <w:rPr>
                 <w:sz w:val="24"/>
@@ -1204,7 +1135,6 @@
                 <w:sz w:val="24"/>
                 <w:szCs w:val="24"/>
               </w:rPr>
-              <w:lastRenderedPageBreak/>
               <w:t> </w:t>
             </w:r>
           </w:p>
@@ -1220,7 +1150,15 @@
                 <w:sz w:val="24"/>
                 <w:szCs w:val="24"/>
               </w:rPr>
-              <w:t>Retrieved results: The head of state at the time the Apollo 11 crew landed on the Moon (20 July 1969) was **President Richard Nixon** of the United States. The mission record notes that, after “Tranquility Base” had been declared, “President Richard Nixon … spoke to them … ‘Hello, Neil and Buzz…’”</w:t>
+              <w:t>Retrieved results: The head of state at the time the Apollo 11 crew landed on the Moon (20 July 1969) was **President Richard Nixon** of the United States. The mission record notes that, after “Tranquility Base” had been declared, “President Richard Nixon … spoke to them … ‘Hello, Neil and Buzz…</w:t>
+            </w:r>
+            <w:proofErr w:type="gramStart"/>
+            <w:r>
+              <w:rPr>
+                <w:sz w:val="24"/>
+                <w:szCs w:val="24"/>
+              </w:rPr>
+              <w:t>’”</w:t>
             </w:r>
             <w:r>
               <w:rPr>
@@ -1230,6 +1168,7 @@
               </w:rPr>
               <w:t>【</w:t>
             </w:r>
+            <w:proofErr w:type="gramEnd"/>
             <w:r>
               <w:rPr>
                 <w:sz w:val="24"/>
@@ -1312,6 +1251,7 @@
                 <w:sz w:val="24"/>
                 <w:szCs w:val="24"/>
               </w:rPr>
+              <w:lastRenderedPageBreak/>
               <w:t>Observations</w:t>
             </w:r>
             <w:r>
@@ -1376,6 +1316,7 @@
             </w:pPr>
             <w:r>
               <w:rPr>
+                <w:noProof/>
                 <w:sz w:val="24"/>
                 <w:szCs w:val="24"/>
               </w:rPr>
@@ -1453,11 +1394,12 @@
             </w:pPr>
             <w:r>
               <w:rPr>
+                <w:noProof/>
                 <w:sz w:val="24"/>
                 <w:szCs w:val="24"/>
               </w:rPr>
               <w:drawing>
-                <wp:inline distT="0" distB="0" distL="0" distR="0" wp14:anchorId="425056A8" wp14:editId="4310E100">
+                <wp:inline distT="0" distB="0" distL="0" distR="0" wp14:anchorId="425056A8" wp14:editId="6AC603F9">
                   <wp:extent cx="6263640" cy="3337560"/>
                   <wp:effectExtent l="0" t="0" r="3810" b="0"/>
                   <wp:docPr id="649733520" name="Picture 6"/>
@@ -1626,6 +1568,7 @@
                 <w:sz w:val="24"/>
                 <w:szCs w:val="24"/>
               </w:rPr>
+              <w:lastRenderedPageBreak/>
               <w:t>Retrieved results:  Apollo 1 was lost in a launch</w:t>
             </w:r>
             <w:r>
@@ -1709,21 +1652,6 @@
                 <w:sz w:val="24"/>
                 <w:szCs w:val="24"/>
               </w:rPr>
-              <w:t> </w:t>
-            </w:r>
-          </w:p>
-          <w:p>
-            <w:pPr>
-              <w:rPr>
-                <w:sz w:val="24"/>
-                <w:szCs w:val="24"/>
-              </w:rPr>
-            </w:pPr>
-            <w:r>
-              <w:rPr>
-                <w:sz w:val="24"/>
-                <w:szCs w:val="24"/>
-              </w:rPr>
               <w:t>Follow up Query:  what was the reason for fail? </w:t>
             </w:r>
           </w:p>
@@ -1958,6 +1886,7 @@
             </w:pPr>
             <w:r>
               <w:rPr>
+                <w:noProof/>
                 <w:sz w:val="24"/>
                 <w:szCs w:val="24"/>
               </w:rPr>
@@ -2078,7 +2007,6 @@
                 <w:sz w:val="24"/>
                 <w:szCs w:val="24"/>
               </w:rPr>
-              <w:lastRenderedPageBreak/>
               <w:t>Query 3</w:t>
             </w:r>
           </w:p>
@@ -2155,6 +2083,7 @@
                 <w:sz w:val="24"/>
                 <w:szCs w:val="24"/>
               </w:rPr>
+              <w:lastRenderedPageBreak/>
               <w:t>The Apollo program officially adopted **lunar</w:t>
             </w:r>
             <w:r>
@@ -2498,10 +2427,10 @@
             </w:pPr>
             <w:r>
               <w:rPr>
-                <w:sz w:val="24"/>
-                <w:szCs w:val="24"/>
-              </w:rPr>
-              <w:lastRenderedPageBreak/>
+                <w:noProof/>
+                <w:sz w:val="24"/>
+                <w:szCs w:val="24"/>
+              </w:rPr>
               <w:drawing>
                 <wp:inline distT="0" distB="0" distL="0" distR="0" wp14:anchorId="2899F388" wp14:editId="15A2E71F">
                   <wp:extent cx="6263640" cy="1506220"/>
@@ -2588,6 +2517,7 @@
                 <w:sz w:val="24"/>
                 <w:szCs w:val="24"/>
               </w:rPr>
+              <w:lastRenderedPageBreak/>
               <w:t>There is reference of multiple docs. The information is not available directly. The Model has calculated the days starting from 1Jul 1962 while it should have used the James Webb's announcement date of July 11, 1962</w:t>
             </w:r>
           </w:p>
@@ -2747,6 +2677,7 @@
             </w:pPr>
             <w:r>
               <w:rPr>
+                <w:noProof/>
                 <w:sz w:val="24"/>
                 <w:szCs w:val="24"/>
               </w:rPr>
@@ -2836,22 +2767,67 @@
                 <w:sz w:val="24"/>
                 <w:szCs w:val="24"/>
               </w:rPr>
-              <w:t>: The information is present on the page but still Hybrid approach is failing to get the answer. It means that neither BM25 nor did the Vector could short that chunk in Top K. BM25 failed because the word 'Height' is not referenced in source document and Vector might have failed because it was pushed too low. Let me try changing Top K…</w:t>
-            </w:r>
-          </w:p>
-          <w:p>
-            <w:pPr>
-              <w:rPr>
-                <w:sz w:val="24"/>
-                <w:szCs w:val="24"/>
-              </w:rPr>
-            </w:pPr>
-            <w:r>
-              <w:rPr>
-                <w:sz w:val="24"/>
-                <w:szCs w:val="24"/>
-              </w:rPr>
-              <w:t xml:space="preserve">I tried changing the Weightage of BM25 to 0.1 and Weightage of Vector to 0.9 and </w:t>
+              <w:t xml:space="preserve">: The information is present on the page but still Hybrid approach is failing to get the answer. It means that neither BM25 nor did the Vector could short that chunk in Top K. BM25 failed because the word 'Height' is not referenced in source document and </w:t>
+            </w:r>
+            <w:r>
+              <w:rPr>
+                <w:sz w:val="24"/>
+                <w:szCs w:val="24"/>
+              </w:rPr>
+              <w:t xml:space="preserve">Hybrid </w:t>
+            </w:r>
+            <w:r>
+              <w:rPr>
+                <w:sz w:val="24"/>
+                <w:szCs w:val="24"/>
+              </w:rPr>
+              <w:t>might have failed because it was pushed too low.</w:t>
+            </w:r>
+          </w:p>
+          <w:p>
+            <w:pPr>
+              <w:rPr>
+                <w:sz w:val="24"/>
+                <w:szCs w:val="24"/>
+              </w:rPr>
+            </w:pPr>
+            <w:r>
+              <w:rPr>
+                <w:sz w:val="24"/>
+                <w:szCs w:val="24"/>
+              </w:rPr>
+              <w:t>I changed the code and printed the results from all three approaches; the Vector Retriever found the result but Hybrid failed to answer.</w:t>
+            </w:r>
+          </w:p>
+          <w:p>
+            <w:pPr>
+              <w:rPr>
+                <w:sz w:val="24"/>
+                <w:szCs w:val="24"/>
+              </w:rPr>
+            </w:pPr>
+            <w:r>
+              <w:rPr>
+                <w:sz w:val="24"/>
+                <w:szCs w:val="24"/>
+                <w:highlight w:val="yellow"/>
+              </w:rPr>
+              <w:t>Answer from BM25</w:t>
+            </w:r>
+          </w:p>
+          <w:p>
+            <w:pPr>
+              <w:rPr>
+                <w:sz w:val="24"/>
+                <w:szCs w:val="24"/>
+              </w:rPr>
+            </w:pPr>
+            <w:r>
+              <w:rPr>
+                <w:sz w:val="24"/>
+                <w:szCs w:val="24"/>
+              </w:rPr>
+              <w:t xml:space="preserve">: The provided Apollo 11 </w:t>
             </w:r>
             <w:proofErr w:type="spellStart"/>
             <w:r>
@@ -2859,7 +2835,7 @@
                 <w:sz w:val="24"/>
                 <w:szCs w:val="24"/>
               </w:rPr>
-              <w:t>TopK</w:t>
+              <w:t>WikiFile</w:t>
             </w:r>
             <w:proofErr w:type="spellEnd"/>
             <w:r>
@@ -2867,8 +2843,144 @@
                 <w:sz w:val="24"/>
                 <w:szCs w:val="24"/>
               </w:rPr>
-              <w:t xml:space="preserve"> to 400 from 4. but still no luck.</w:t>
-            </w:r>
+              <w:t xml:space="preserve"> does not include the height of the Saturn V launch vehicle.</w:t>
+            </w:r>
+          </w:p>
+          <w:p>
+            <w:pPr>
+              <w:rPr>
+                <w:sz w:val="24"/>
+                <w:szCs w:val="24"/>
+              </w:rPr>
+            </w:pPr>
+            <w:r>
+              <w:rPr>
+                <w:sz w:val="24"/>
+                <w:szCs w:val="24"/>
+                <w:highlight w:val="yellow"/>
+              </w:rPr>
+              <w:t>Answer from Vector</w:t>
+            </w:r>
+          </w:p>
+          <w:p>
+            <w:pPr>
+              <w:rPr>
+                <w:sz w:val="24"/>
+                <w:szCs w:val="24"/>
+              </w:rPr>
+            </w:pPr>
+            <w:r>
+              <w:rPr>
+                <w:sz w:val="24"/>
+                <w:szCs w:val="24"/>
+              </w:rPr>
+              <w:t>: The Saturn V rocket used for Apollo 11 was **363 feet (about 111 meters) tall**.</w:t>
+            </w:r>
+          </w:p>
+          <w:p>
+            <w:pPr>
+              <w:rPr>
+                <w:sz w:val="24"/>
+                <w:szCs w:val="24"/>
+              </w:rPr>
+            </w:pPr>
+            <w:r>
+              <w:rPr>
+                <w:sz w:val="24"/>
+                <w:szCs w:val="24"/>
+                <w:highlight w:val="yellow"/>
+              </w:rPr>
+              <w:t>Answer from Hybrid</w:t>
+            </w:r>
+          </w:p>
+          <w:p>
+            <w:pPr>
+              <w:rPr>
+                <w:sz w:val="24"/>
+                <w:szCs w:val="24"/>
+              </w:rPr>
+            </w:pPr>
+            <w:r>
+              <w:rPr>
+                <w:sz w:val="24"/>
+                <w:szCs w:val="24"/>
+              </w:rPr>
+              <w:t xml:space="preserve">: The provided Apollo 11 </w:t>
+            </w:r>
+            <w:proofErr w:type="spellStart"/>
+            <w:r>
+              <w:rPr>
+                <w:sz w:val="24"/>
+                <w:szCs w:val="24"/>
+              </w:rPr>
+              <w:t>WikiFile</w:t>
+            </w:r>
+            <w:proofErr w:type="spellEnd"/>
+            <w:r>
+              <w:rPr>
+                <w:sz w:val="24"/>
+                <w:szCs w:val="24"/>
+              </w:rPr>
+              <w:t xml:space="preserve"> does not include the height of the Saturn V launch vehicle.</w:t>
+            </w:r>
+          </w:p>
+          <w:p>
+            <w:pPr>
+              <w:rPr>
+                <w:sz w:val="24"/>
+                <w:szCs w:val="24"/>
+              </w:rPr>
+            </w:pPr>
+            <w:r>
+              <w:rPr>
+                <w:sz w:val="24"/>
+                <w:szCs w:val="24"/>
+              </w:rPr>
+              <w:lastRenderedPageBreak/>
+              <w:drawing>
+                <wp:inline distT="0" distB="0" distL="0" distR="0" wp14:anchorId="7DFCD3C1" wp14:editId="5B2A63EF">
+                  <wp:extent cx="6102214" cy="2299648"/>
+                  <wp:effectExtent l="0" t="0" r="0" b="5715"/>
+                  <wp:docPr id="1949638166" name="Picture 1"/>
+                  <wp:cNvGraphicFramePr>
+                    <a:graphicFrameLocks xmlns:a="http://schemas.openxmlformats.org/drawingml/2006/main" noChangeAspect="1"/>
+                  </wp:cNvGraphicFramePr>
+                  <a:graphic xmlns:a="http://schemas.openxmlformats.org/drawingml/2006/main">
+                    <a:graphicData uri="http://schemas.openxmlformats.org/drawingml/2006/picture">
+                      <pic:pic xmlns:pic="http://schemas.openxmlformats.org/drawingml/2006/picture">
+                        <pic:nvPicPr>
+                          <pic:cNvPr id="1949638166" name=""/>
+                          <pic:cNvPicPr/>
+                        </pic:nvPicPr>
+                        <pic:blipFill>
+                          <a:blip r:embed="rId14"/>
+                          <a:stretch>
+                            <a:fillRect/>
+                          </a:stretch>
+                        </pic:blipFill>
+                        <pic:spPr>
+                          <a:xfrm>
+                            <a:off x="0" y="0"/>
+                            <a:ext cx="6139016" cy="2313517"/>
+                          </a:xfrm>
+                          <a:prstGeom prst="rect">
+                            <a:avLst/>
+                          </a:prstGeom>
+                        </pic:spPr>
+                      </pic:pic>
+                    </a:graphicData>
+                  </a:graphic>
+                </wp:inline>
+              </w:drawing>
+            </w:r>
+          </w:p>
+          <w:p>
+            <w:pPr>
+              <w:rPr>
+                <w:sz w:val="24"/>
+                <w:szCs w:val="24"/>
+              </w:rPr>
+            </w:pPr>
           </w:p>
           <w:p>
             <w:pPr>
@@ -2894,6 +3006,7 @@
             </w:pPr>
             <w:r>
               <w:rPr>
+                <w:noProof/>
                 <w:sz w:val="24"/>
                 <w:szCs w:val="24"/>
               </w:rPr>
@@ -2916,7 +3029,7 @@
                           </pic:cNvPicPr>
                         </pic:nvPicPr>
                         <pic:blipFill>
-                          <a:blip r:embed="rId14">
+                          <a:blip r:embed="rId15">
                             <a:extLst>
                               <a:ext uri="{28A0092B-C50C-407E-A947-70E740481C1C}">
                                 <a14:useLocalDpi xmlns:a14="http://schemas.microsoft.com/office/drawing/2010/main" val="0"/>
@@ -3261,7 +3374,23 @@
                 <w:sz w:val="24"/>
                 <w:szCs w:val="24"/>
               </w:rPr>
-              <w:t>The limitation is the retrieval works and returns the chunks containing the relevant timestamps, but it could not figure out the day of the month in a multi-step dependencies across document sections.</w:t>
+              <w:t xml:space="preserve">The limitation is the retrieval works and returns the chunks containing the relevant timestamps, but it could not figure out the day of the month in a </w:t>
+            </w:r>
+            <w:proofErr w:type="gramStart"/>
+            <w:r>
+              <w:rPr>
+                <w:sz w:val="24"/>
+                <w:szCs w:val="24"/>
+              </w:rPr>
+              <w:t>multi-step dependencies</w:t>
+            </w:r>
+            <w:proofErr w:type="gramEnd"/>
+            <w:r>
+              <w:rPr>
+                <w:sz w:val="24"/>
+                <w:szCs w:val="24"/>
+              </w:rPr>
+              <w:t xml:space="preserve"> across document sections.</w:t>
             </w:r>
           </w:p>
           <w:p>
@@ -3558,7 +3687,21 @@
                 <w:sz w:val="24"/>
                 <w:szCs w:val="24"/>
               </w:rPr>
-              <w:t xml:space="preserve"> but Model is unable to find it. The details are given above under "</w:t>
+              <w:t xml:space="preserve"> but </w:t>
+            </w:r>
+            <w:r>
+              <w:rPr>
+                <w:sz w:val="24"/>
+                <w:szCs w:val="24"/>
+              </w:rPr>
+              <w:t xml:space="preserve">Hybrid approach </w:t>
+            </w:r>
+            <w:r>
+              <w:rPr>
+                <w:sz w:val="24"/>
+                <w:szCs w:val="24"/>
+              </w:rPr>
+              <w:t>is unable to find it. The details are given above under "</w:t>
             </w:r>
             <w:r>
               <w:rPr>
@@ -3621,6 +3764,7 @@
             </w:pPr>
             <w:r>
               <w:rPr>
+                <w:noProof/>
                 <w:sz w:val="24"/>
                 <w:szCs w:val="24"/>
               </w:rPr>
@@ -3642,7 +3786,7 @@
                           </pic:cNvPicPr>
                         </pic:nvPicPr>
                         <pic:blipFill>
-                          <a:blip r:embed="rId15">
+                          <a:blip r:embed="rId16">
                             <a:extLst>
                               <a:ext uri="{28A0092B-C50C-407E-A947-70E740481C1C}">
                                 <a14:useLocalDpi xmlns:a14="http://schemas.microsoft.com/office/drawing/2010/main" val="0"/>
@@ -3782,7 +3926,7 @@
         </w:rPr>
         <w:t xml:space="preserve">Git- </w:t>
       </w:r>
-      <w:hyperlink r:id="rId16" w:history="1">
+      <w:hyperlink r:id="rId17" w:history="1">
         <w:r>
           <w:rPr>
             <w:rStyle w:val="Hyperlink"/>
@@ -3807,7 +3951,7 @@
         </w:rPr>
         <w:t xml:space="preserve">Wikipedia- </w:t>
       </w:r>
-      <w:hyperlink r:id="rId17" w:history="1">
+      <w:hyperlink r:id="rId18" w:history="1">
         <w:r>
           <w:rPr>
             <w:rStyle w:val="Hyperlink"/>
@@ -3897,10 +4041,10 @@
       </w:r>
     </w:p>
     <w:sectPr>
-      <w:headerReference w:type="even" r:id="rId18"/>
-      <w:headerReference w:type="default" r:id="rId19"/>
-      <w:footerReference w:type="default" r:id="rId20"/>
-      <w:headerReference w:type="first" r:id="rId21"/>
+      <w:headerReference w:type="even" r:id="rId19"/>
+      <w:headerReference w:type="default" r:id="rId20"/>
+      <w:footerReference w:type="default" r:id="rId21"/>
+      <w:headerReference w:type="first" r:id="rId22"/>
       <w:pgSz w:w="12240" w:h="15840"/>
       <w:pgMar w:top="1440" w:right="567" w:bottom="1440" w:left="567" w:header="57" w:footer="170" w:gutter="0"/>
       <w:pgNumType w:start="1"/>
@@ -5884,6 +6028,7 @@
   <w:style w:type="character" w:default="1" w:styleId="DefaultParagraphFont">
     <w:name w:val="Default Paragraph Font"/>
     <w:uiPriority w:val="1"/>
+    <w:semiHidden/>
     <w:unhideWhenUsed/>
   </w:style>
   <w:style w:type="table" w:default="1" w:styleId="TableNormal">

</xml_diff>